<commit_message>
Remove the statement for the court to confirm the July 8 date.
</commit_message>
<xml_diff>
--- a/Filings/Discovery/discoveryPlanAndInformationalStatement/Plaintiffs_Letter_to_Court_re_Discovery_Plan.docx
+++ b/Filings/Discovery/discoveryPlanAndInformationalStatement/Plaintiffs_Letter_to_Court_re_Discovery_Plan.docx
@@ -574,22 +574,6 @@
     </w:p>
     <w:p>
       <w:pPr>
-        <w:spacing w:after="200" w:before="0"/>
-        <w:jc w:val="both"/>
-      </w:pPr>
-      <w:r>
-        <w:rPr>
-          <w:rFonts w:ascii="Times New Roman" w:hAnsi="Times New Roman"/>
-          <w:b w:val="0"/>
-          <w:i w:val="0"/>
-          <w:sz w:val="24"/>
-          <w:u w:val="none"/>
-        </w:rPr>
-        <w:t>Finally, Plaintiffs respectfully note that their motion of July 20, 2026 under Minn. Gen. R. Prac. 11.05, seeking to have the corrected Complaint deemed filed as of July 8, 2026, remains undecided. If the Court sets a scheduling conference, Plaintiffs request that this motion be addressed at that time or decided on the written submissions.</w:t>
-      </w:r>
-    </w:p>
-    <w:p>
-      <w:pPr>
         <w:spacing w:after="320" w:before="0"/>
         <w:jc w:val="both"/>
       </w:pPr>

</xml_diff>

<commit_message>
Updates to the letter, eFS, and include Jeffrey.
</commit_message>
<xml_diff>
--- a/Filings/Discovery/discoveryPlanAndInformationalStatement/Plaintiffs_Letter_to_Court_re_Discovery_Plan.docx
+++ b/Filings/Discovery/discoveryPlanAndInformationalStatement/Plaintiffs_Letter_to_Court_re_Discovery_Plan.docx
@@ -148,7 +148,7 @@
           <w:sz w:val="24"/>
           <w:u w:val="none"/>
         </w:rPr>
-        <w:t>August 31, 2026</w:t>
+        <w:t>September 1, 2026</w:t>
       </w:r>
     </w:p>
     <w:p>
@@ -163,7 +163,7 @@
           <w:sz w:val="24"/>
           <w:u w:val="single"/>
         </w:rPr>
-        <w:t>Via eFS and U.S. Mail</w:t>
+        <w:t>Via U.S. Mail</w:t>
       </w:r>
     </w:p>
     <w:p>
@@ -495,7 +495,7 @@
           <w:sz w:val="24"/>
           <w:u w:val="none"/>
         </w:rPr>
-        <w:t xml:space="preserve">  Plaintiffs anticipate that Defendant will seek to designate portions of its claim file and business records as confidential. Plaintiffs will agree to a reasonable single-tier order, but cannot agree to an “attorneys’ eyes only” or other counsel-only tier: Plaintiffs appear pro se and have no counsel of record, so such a tier would operate as a complete bar on their access to the evidence in their own case. Defendant’s draft contains no confidentiality paragraph.</w:t>
+        <w:t xml:space="preserve">  Plaintiffs anticipate that Defendant will seek to designate portions of its claim file and business records as confidential. Plaintiffs will agree to a reasonable single-tier order, but cannot agree to an “attorneys’ eyes only” or other counsel-only tier: Plaintiffs appear pro se and have no counsel of record, so such a tier would operate as a complete bar on their access to the evidence in their own case. As to the persons permitted access to material designated CONFIDENTIAL, Plaintiffs ask that the order include Jeffrey Hu, who assists Plaintiffs in preparing this litigation and whose access the parties discussed at the conference, provided that he first sign a written undertaking to be bound by the order. Defendant’s draft contains no confidentiality paragraph.</w:t>
       </w:r>
     </w:p>
     <w:p>
@@ -769,7 +769,7 @@
           <w:sz w:val="24"/>
           <w:u w:val="none"/>
         </w:rPr>
-        <w:t>Attorneys for Defendant (via eFS and U.S. Mail)</w:t>
+        <w:t>Attorneys for Defendant (via U.S. Mail)</w:t>
       </w:r>
     </w:p>
     <w:sectPr>

</xml_diff>